<commit_message>
Added Some Date info
</commit_message>
<xml_diff>
--- a/Bangla Note [Ujjwal].docx
+++ b/Bangla Note [Ujjwal].docx
@@ -4,6 +4,15 @@
   <w:body>
     <w:sdt>
       <w:sdtPr>
+        <w:rPr>
+          <w:rFonts w:asciiTheme="minorHAnsi" w:eastAsiaTheme="minorHAnsi" w:hAnsiTheme="minorHAnsi" w:cstheme="minorBidi"/>
+          <w:b w:val="0"/>
+          <w:bCs w:val="0"/>
+          <w:color w:val="auto"/>
+          <w:sz w:val="22"/>
+          <w:szCs w:val="22"/>
+          <w:lang w:eastAsia="en-US"/>
+        </w:rPr>
         <w:id w:val="1935390481"/>
         <w:docPartObj>
           <w:docPartGallery w:val="Table of Contents"/>
@@ -12,12 +21,7 @@
       </w:sdtPr>
       <w:sdtEndPr>
         <w:rPr>
-          <w:rFonts w:asciiTheme="minorHAnsi" w:eastAsiaTheme="minorHAnsi" w:hAnsiTheme="minorHAnsi" w:cstheme="minorBidi"/>
           <w:noProof/>
-          <w:color w:val="auto"/>
-          <w:sz w:val="22"/>
-          <w:szCs w:val="22"/>
-          <w:lang w:eastAsia="en-US"/>
         </w:rPr>
       </w:sdtEndPr>
       <w:sdtContent>
@@ -255,38 +259,16 @@
           <w:rFonts w:ascii="SutonnyMJ" w:eastAsia="Times New Roman" w:hAnsi="SutonnyMJ" w:cs="SutonnyMJ"/>
           <w:sz w:val="32"/>
         </w:rPr>
-      </w:r>
-      <w:r>
-        <w:rPr>
+        <w:fldChar w:fldCharType="separate"/>
+      </w:r>
+      <w:bookmarkStart w:id="0" w:name="_Toc195805263"/>
+      <w:r>
+        <w:rPr>
+          <w:rStyle w:val="Hyperlink"/>
           <w:rFonts w:ascii="SutonnyMJ" w:eastAsia="Times New Roman" w:hAnsi="SutonnyMJ" w:cs="SutonnyMJ"/>
           <w:sz w:val="32"/>
         </w:rPr>
-        <w:fldChar w:fldCharType="separate"/>
-      </w:r>
-      <w:bookmarkStart w:id="0" w:name="_Toc195805263"/>
-      <w:r>
-        <w:rPr>
-          <w:rStyle w:val="Hyperlink"/>
-          <w:rFonts w:ascii="SutonnyMJ" w:eastAsia="Times New Roman" w:hAnsi="SutonnyMJ" w:cs="SutonnyMJ"/>
-          <w:sz w:val="32"/>
-        </w:rPr>
-        <w:t>weL¨vZ 11 Rb</w:t>
-      </w:r>
-      <w:r>
-        <w:rPr>
-          <w:rStyle w:val="Hyperlink"/>
-          <w:rFonts w:ascii="SutonnyMJ" w:eastAsia="Times New Roman" w:hAnsi="SutonnyMJ" w:cs="SutonnyMJ"/>
-          <w:sz w:val="32"/>
-        </w:rPr>
-        <w:t xml:space="preserve"> </w:t>
-      </w:r>
-      <w:r>
-        <w:rPr>
-          <w:rStyle w:val="Hyperlink"/>
-          <w:rFonts w:ascii="SutonnyMJ" w:eastAsia="Times New Roman" w:hAnsi="SutonnyMJ" w:cs="SutonnyMJ"/>
-          <w:sz w:val="32"/>
-        </w:rPr>
-        <w:t>†jL‡Ki</w:t>
+        <w:t>weL¨vZ 11 Rb †jL‡Ki</w:t>
       </w:r>
       <w:r>
         <w:rPr>
@@ -922,12 +904,6 @@
           <w:sz w:val="32"/>
         </w:rPr>
         <w:instrText xml:space="preserve"> HYPERLINK  \l "_weL¨vZ_11_Rb" </w:instrText>
-      </w:r>
-      <w:r>
-        <w:rPr>
-          <w:rFonts w:ascii="SutonnyMJ" w:eastAsia="Times New Roman" w:hAnsi="SutonnyMJ" w:cs="SutonnyMJ"/>
-          <w:sz w:val="32"/>
-        </w:rPr>
       </w:r>
       <w:r>
         <w:rPr>
@@ -1100,16 +1076,7 @@
                 <w:sz w:val="28"/>
                 <w:szCs w:val="28"/>
               </w:rPr>
-              <w:t>Rxwe‡Zk</w:t>
-            </w:r>
-            <w:r>
-              <w:rPr>
-                <w:rFonts w:ascii="SutonnyMJ" w:eastAsia="Times New Roman" w:hAnsi="SutonnyMJ" w:cs="SutonnyMJ"/>
-                <w:color w:val="080809"/>
-                <w:sz w:val="28"/>
-                <w:szCs w:val="28"/>
-              </w:rPr>
-              <w:t xml:space="preserve"> Rxwe‡Zk¦i</w:t>
+              <w:t>Rxwe‡Zk Rxwe‡Zk¦i</w:t>
             </w:r>
           </w:p>
         </w:tc>
@@ -1157,16 +1124,7 @@
                 <w:sz w:val="28"/>
                 <w:szCs w:val="28"/>
               </w:rPr>
-              <w:t>RM`xk</w:t>
-            </w:r>
-            <w:r>
-              <w:rPr>
-                <w:rFonts w:ascii="SutonnyMJ" w:eastAsia="Times New Roman" w:hAnsi="SutonnyMJ" w:cs="SutonnyMJ"/>
-                <w:color w:val="080809"/>
-                <w:sz w:val="28"/>
-                <w:szCs w:val="28"/>
-              </w:rPr>
-              <w:t>, RMb¥q</w:t>
+              <w:t>RM`xk, RMb¥q</w:t>
             </w:r>
           </w:p>
         </w:tc>
@@ -1206,7 +1164,7 @@
             <w:r>
               <w:rPr>
                 <w:rFonts w:ascii="SutonnyMJ" w:eastAsia="Times New Roman" w:hAnsi="SutonnyMJ" w:cs="SutonnyMJ"/>
-                <w:color w:val="080809"/>
+                <w:color w:val="00B050"/>
                 <w:sz w:val="28"/>
                 <w:szCs w:val="28"/>
               </w:rPr>
@@ -1215,7 +1173,7 @@
             <w:r>
               <w:rPr>
                 <w:rFonts w:ascii="SutonnyMJ" w:eastAsia="Times New Roman" w:hAnsi="SutonnyMJ" w:cs="SutonnyMJ"/>
-                <w:color w:val="080809"/>
+                <w:color w:val="00B050"/>
                 <w:sz w:val="28"/>
                 <w:szCs w:val="28"/>
               </w:rPr>
@@ -1252,16 +1210,7 @@
                 <w:sz w:val="28"/>
                 <w:szCs w:val="28"/>
               </w:rPr>
-              <w:t>c„_¡xk</w:t>
-            </w:r>
-            <w:r>
-              <w:rPr>
-                <w:rFonts w:ascii="SutonnyMJ" w:eastAsia="Times New Roman" w:hAnsi="SutonnyMJ" w:cs="SutonnyMJ"/>
-                <w:color w:val="080809"/>
-                <w:sz w:val="28"/>
-                <w:szCs w:val="28"/>
-              </w:rPr>
-              <w:t xml:space="preserve"> </w:t>
+              <w:t xml:space="preserve">c„_¡xk </w:t>
             </w:r>
           </w:p>
         </w:tc>
@@ -1492,40 +1441,31 @@
             <w:r>
               <w:rPr>
                 <w:rFonts w:ascii="SutonnyMJ" w:eastAsia="Times New Roman" w:hAnsi="SutonnyMJ" w:cs="SutonnyMJ"/>
-                <w:color w:val="080809"/>
-                <w:sz w:val="28"/>
-                <w:szCs w:val="28"/>
-              </w:rPr>
-              <w:t>‰ek¦vbi</w:t>
-            </w:r>
-            <w:r>
-              <w:rPr>
-                <w:rFonts w:ascii="SutonnyMJ" w:eastAsia="Times New Roman" w:hAnsi="SutonnyMJ" w:cs="SutonnyMJ"/>
-                <w:color w:val="080809"/>
-                <w:sz w:val="28"/>
-                <w:szCs w:val="28"/>
-              </w:rPr>
-              <w:t xml:space="preserve"> wek¦cv</w:t>
-            </w:r>
-          </w:p>
-        </w:tc>
-        <w:tc>
-          <w:tcPr>
-            <w:tcW w:w="3192" w:type="dxa"/>
-          </w:tcPr>
-          <w:p>
-            <w:pPr>
-              <w:rPr>
-                <w:rFonts w:ascii="SutonnyMJ" w:eastAsia="Times New Roman" w:hAnsi="SutonnyMJ" w:cs="SutonnyMJ"/>
-                <w:color w:val="080809"/>
-                <w:sz w:val="28"/>
-                <w:szCs w:val="28"/>
-              </w:rPr>
-            </w:pPr>
-            <w:r>
-              <w:rPr>
-                <w:rFonts w:ascii="SutonnyMJ" w:eastAsia="Times New Roman" w:hAnsi="SutonnyMJ" w:cs="SutonnyMJ"/>
-                <w:color w:val="080809"/>
+                <w:color w:val="C00000"/>
+                <w:sz w:val="28"/>
+                <w:szCs w:val="28"/>
+              </w:rPr>
+              <w:t>‰ek¦vbi wek¦cv</w:t>
+            </w:r>
+          </w:p>
+        </w:tc>
+        <w:tc>
+          <w:tcPr>
+            <w:tcW w:w="3192" w:type="dxa"/>
+          </w:tcPr>
+          <w:p>
+            <w:pPr>
+              <w:rPr>
+                <w:rFonts w:ascii="SutonnyMJ" w:eastAsia="Times New Roman" w:hAnsi="SutonnyMJ" w:cs="SutonnyMJ"/>
+                <w:color w:val="080809"/>
+                <w:sz w:val="28"/>
+                <w:szCs w:val="28"/>
+              </w:rPr>
+            </w:pPr>
+            <w:r>
+              <w:rPr>
+                <w:rFonts w:ascii="SutonnyMJ" w:eastAsia="Times New Roman" w:hAnsi="SutonnyMJ" w:cs="SutonnyMJ"/>
+                <w:color w:val="00B050"/>
                 <w:sz w:val="28"/>
                 <w:szCs w:val="28"/>
               </w:rPr>
@@ -1579,16 +1519,7 @@
                 <w:sz w:val="28"/>
                 <w:szCs w:val="28"/>
               </w:rPr>
-              <w:t>wkLver</w:t>
-            </w:r>
-            <w:r>
-              <w:rPr>
-                <w:rFonts w:ascii="SutonnyMJ" w:eastAsia="Times New Roman" w:hAnsi="SutonnyMJ" w:cs="SutonnyMJ"/>
-                <w:color w:val="080809"/>
-                <w:sz w:val="28"/>
-                <w:szCs w:val="28"/>
-              </w:rPr>
-              <w:t xml:space="preserve"> </w:t>
+              <w:t xml:space="preserve">wkLver </w:t>
             </w:r>
             <w:r>
               <w:rPr>
@@ -1621,16 +1552,7 @@
                 <w:sz w:val="28"/>
                 <w:szCs w:val="28"/>
               </w:rPr>
-              <w:t>nwiekb</w:t>
-            </w:r>
-            <w:r>
-              <w:rPr>
-                <w:rFonts w:ascii="SutonnyMJ" w:eastAsia="Times New Roman" w:hAnsi="SutonnyMJ" w:cs="SutonnyMJ"/>
-                <w:color w:val="080809"/>
-                <w:sz w:val="28"/>
-                <w:szCs w:val="28"/>
-              </w:rPr>
-              <w:t xml:space="preserve"> </w:t>
+              <w:t xml:space="preserve">nwiekb </w:t>
             </w:r>
             <w:r>
               <w:rPr>
@@ -1698,25 +1620,7 @@
                 <w:sz w:val="28"/>
                 <w:szCs w:val="28"/>
               </w:rPr>
-              <w:t xml:space="preserve">AwMœ </w:t>
-            </w:r>
-            <w:r>
-              <w:rPr>
-                <w:rFonts w:ascii="SutonnyMJ" w:eastAsia="Times New Roman" w:hAnsi="SutonnyMJ" w:cs="SutonnyMJ"/>
-                <w:color w:val="080809"/>
-                <w:sz w:val="28"/>
-                <w:szCs w:val="28"/>
-              </w:rPr>
-              <w:t>ewý</w:t>
-            </w:r>
-            <w:r>
-              <w:rPr>
-                <w:rFonts w:ascii="SutonnyMJ" w:eastAsia="Times New Roman" w:hAnsi="SutonnyMJ" w:cs="SutonnyMJ"/>
-                <w:color w:val="080809"/>
-                <w:sz w:val="28"/>
-                <w:szCs w:val="28"/>
-              </w:rPr>
-              <w:t xml:space="preserve"> Abj </w:t>
+              <w:t xml:space="preserve">AwMœ ewý Abj </w:t>
             </w:r>
           </w:p>
         </w:tc>
@@ -1766,7 +1670,17 @@
                 <w:sz w:val="28"/>
                 <w:szCs w:val="28"/>
               </w:rPr>
-              <w:t>ïwP mßvsï</w:t>
+              <w:t xml:space="preserve">ïwP </w:t>
+            </w:r>
+            <w:r>
+              <w:rPr>
+                <w:rFonts w:ascii="SutonnyMJ" w:eastAsia="Times New Roman" w:hAnsi="SutonnyMJ" w:cs="SutonnyMJ"/>
+                <w:b/>
+                <w:color w:val="00B050"/>
+                <w:sz w:val="28"/>
+                <w:szCs w:val="28"/>
+              </w:rPr>
+              <w:t>mßvsï</w:t>
             </w:r>
           </w:p>
         </w:tc>
@@ -2067,7 +1981,7 @@
             <w:r>
               <w:rPr>
                 <w:rFonts w:ascii="SutonnyMJ" w:eastAsia="Times New Roman" w:hAnsi="SutonnyMJ" w:cs="SutonnyMJ"/>
-                <w:color w:val="080809"/>
+                <w:color w:val="C00000"/>
                 <w:sz w:val="28"/>
                 <w:szCs w:val="28"/>
               </w:rPr>
@@ -2091,7 +2005,7 @@
             <w:r>
               <w:rPr>
                 <w:rFonts w:ascii="SutonnyMJ" w:eastAsia="Times New Roman" w:hAnsi="SutonnyMJ" w:cs="SutonnyMJ"/>
-                <w:color w:val="080809"/>
+                <w:color w:val="00B050"/>
                 <w:sz w:val="28"/>
                 <w:szCs w:val="28"/>
               </w:rPr>
@@ -2442,7 +2356,16 @@
                 <w:sz w:val="28"/>
                 <w:szCs w:val="28"/>
               </w:rPr>
-              <w:t>ElvcwZ c~lY</w:t>
+              <w:t xml:space="preserve">ElvcwZ </w:t>
+            </w:r>
+            <w:r>
+              <w:rPr>
+                <w:rFonts w:ascii="SutonnyMJ" w:eastAsia="Times New Roman" w:hAnsi="SutonnyMJ" w:cs="SutonnyMJ"/>
+                <w:color w:val="00B050"/>
+                <w:sz w:val="28"/>
+                <w:szCs w:val="28"/>
+              </w:rPr>
+              <w:t>c~lY</w:t>
             </w:r>
           </w:p>
         </w:tc>
@@ -2640,24 +2563,8 @@
               </w:rPr>
               <w:t>ZvivcwZ Zvivbv_</w:t>
             </w:r>
-            <w:r>
-              <w:rPr>
-                <w:rFonts w:ascii="SutonnyMJ" w:eastAsia="Times New Roman" w:hAnsi="SutonnyMJ" w:cs="SutonnyMJ"/>
-                <w:color w:val="080809"/>
-                <w:sz w:val="28"/>
-                <w:szCs w:val="28"/>
-              </w:rPr>
-              <w:t xml:space="preserve"> </w:t>
-            </w:r>
-            <w:r>
-              <w:rPr>
-                <w:rFonts w:ascii="SutonnyMJ" w:eastAsia="Times New Roman" w:hAnsi="SutonnyMJ" w:cs="SutonnyMJ"/>
-                <w:color w:val="080809"/>
-                <w:sz w:val="28"/>
-                <w:szCs w:val="28"/>
-              </w:rPr>
-              <w:t>kkx</w:t>
-            </w:r>
+            <w:bookmarkStart w:id="2" w:name="_GoBack"/>
+            <w:bookmarkEnd w:id="2"/>
           </w:p>
         </w:tc>
       </w:tr>
@@ -2682,7 +2589,16 @@
                 <w:sz w:val="28"/>
                 <w:szCs w:val="28"/>
               </w:rPr>
-              <w:t>kxZvsï mxZvsï †njvj wngvsï</w:t>
+              <w:t xml:space="preserve">kxZvsï mxZvsï </w:t>
+            </w:r>
+            <w:r>
+              <w:rPr>
+                <w:rFonts w:ascii="SutonnyMJ" w:eastAsia="Times New Roman" w:hAnsi="SutonnyMJ" w:cs="SutonnyMJ"/>
+                <w:color w:val="F79646" w:themeColor="accent6"/>
+                <w:sz w:val="28"/>
+                <w:szCs w:val="28"/>
+              </w:rPr>
+              <w:t>†njvj wngvsï</w:t>
             </w:r>
           </w:p>
         </w:tc>
@@ -2734,8 +2650,6 @@
             </w:r>
           </w:p>
         </w:tc>
-        <w:bookmarkStart w:id="2" w:name="_GoBack"/>
-        <w:bookmarkEnd w:id="2"/>
       </w:tr>
       <w:tr>
         <w:tc>
@@ -2782,6 +2696,24 @@
                 <w:sz w:val="28"/>
                 <w:szCs w:val="28"/>
               </w:rPr>
+              <w:t>kkx</w:t>
+            </w:r>
+            <w:r>
+              <w:rPr>
+                <w:rFonts w:ascii="SutonnyMJ" w:eastAsia="Times New Roman" w:hAnsi="SutonnyMJ" w:cs="SutonnyMJ"/>
+                <w:color w:val="080809"/>
+                <w:sz w:val="28"/>
+                <w:szCs w:val="28"/>
+              </w:rPr>
+              <w:t xml:space="preserve"> </w:t>
+            </w:r>
+            <w:r>
+              <w:rPr>
+                <w:rFonts w:ascii="SutonnyMJ" w:eastAsia="Times New Roman" w:hAnsi="SutonnyMJ" w:cs="SutonnyMJ"/>
+                <w:color w:val="080809"/>
+                <w:sz w:val="28"/>
+                <w:szCs w:val="28"/>
+              </w:rPr>
               <w:t>kkv¼ kkai</w:t>
             </w:r>
           </w:p>
@@ -2894,7 +2826,7 @@
             <w:r>
               <w:rPr>
                 <w:rFonts w:ascii="SutonnyMJ" w:eastAsia="Times New Roman" w:hAnsi="SutonnyMJ" w:cs="SutonnyMJ"/>
-                <w:color w:val="080809"/>
+                <w:color w:val="F79646" w:themeColor="accent6"/>
                 <w:sz w:val="28"/>
                 <w:szCs w:val="28"/>
               </w:rPr>
@@ -2903,7 +2835,7 @@
             <w:r>
               <w:rPr>
                 <w:rFonts w:ascii="SutonnyMJ" w:eastAsia="Times New Roman" w:hAnsi="SutonnyMJ" w:cs="SutonnyMJ"/>
-                <w:color w:val="080809"/>
+                <w:color w:val="F79646" w:themeColor="accent6"/>
                 <w:sz w:val="28"/>
                 <w:szCs w:val="28"/>
               </w:rPr>
@@ -3006,21 +2938,11 @@
                 <w:sz w:val="28"/>
                 <w:szCs w:val="28"/>
               </w:rPr>
-              <w:t>‡RvQbv</w:t>
-            </w:r>
-            <w:r>
-              <w:rPr>
-                <w:rFonts w:ascii="SutonnyMJ" w:eastAsia="Times New Roman" w:hAnsi="SutonnyMJ" w:cs="SutonnyMJ"/>
-                <w:color w:val="080809"/>
-                <w:sz w:val="28"/>
-                <w:szCs w:val="28"/>
-              </w:rPr>
-              <w:t xml:space="preserve"> </w:t>
-            </w:r>
-            <w:r>
-              <w:rPr>
-                <w:rFonts w:ascii="SutonnyMJ" w:eastAsia="Times New Roman" w:hAnsi="SutonnyMJ" w:cs="SutonnyMJ"/>
-                <w:color w:val="080809"/>
+              <w:t xml:space="preserve">‡RvQbv </w:t>
+            </w:r>
+            <w:r>
+              <w:rPr>
+                <w:rFonts w:ascii="SutonnyMJ" w:eastAsia="Times New Roman" w:hAnsi="SutonnyMJ" w:cs="SutonnyMJ"/>
                 <w:sz w:val="28"/>
                 <w:szCs w:val="28"/>
               </w:rPr>
@@ -3136,6 +3058,15 @@
           <w:szCs w:val="32"/>
         </w:rPr>
       </w:pPr>
+      <w:r>
+        <w:rPr>
+          <w:rFonts w:ascii="SutonnyMJ" w:eastAsia="Times New Roman" w:hAnsi="SutonnyMJ" w:cs="SutonnyMJ"/>
+          <w:color w:val="080809"/>
+          <w:sz w:val="32"/>
+          <w:szCs w:val="32"/>
+        </w:rPr>
+        <w:t>s</w:t>
+      </w:r>
     </w:p>
     <w:sectPr>
       <w:pgSz w:w="12240" w:h="15840"/>
@@ -5308,543 +5239,6 @@
 </w:styles>
 </file>
 
-<file path=word/glossary/document.xml><?xml version="1.0" encoding="utf-8"?>
-<w:glossaryDocument xmlns:wpc="http://schemas.microsoft.com/office/word/2010/wordprocessingCanvas" xmlns:mc="http://schemas.openxmlformats.org/markup-compatibility/2006" xmlns:o="urn:schemas-microsoft-com:office:office" xmlns:r="http://schemas.openxmlformats.org/officeDocument/2006/relationships" xmlns:m="http://schemas.openxmlformats.org/officeDocument/2006/math" xmlns:v="urn:schemas-microsoft-com:vml" xmlns:wp14="http://schemas.microsoft.com/office/word/2010/wordprocessingDrawing" xmlns:wp="http://schemas.openxmlformats.org/drawingml/2006/wordprocessingDrawing" xmlns:w10="urn:schemas-microsoft-com:office:word" xmlns:w="http://schemas.openxmlformats.org/wordprocessingml/2006/main" xmlns:w14="http://schemas.microsoft.com/office/word/2010/wordml" xmlns:wpg="http://schemas.microsoft.com/office/word/2010/wordprocessingGroup" xmlns:wpi="http://schemas.microsoft.com/office/word/2010/wordprocessingInk" xmlns:wne="http://schemas.microsoft.com/office/word/2006/wordml" xmlns:wps="http://schemas.microsoft.com/office/word/2010/wordprocessingShape" mc:Ignorable="w14 wp14"/>
-</file>
-
-<file path=word/glossary/fontTable.xml><?xml version="1.0" encoding="utf-8"?>
-<w:fonts xmlns:mc="http://schemas.openxmlformats.org/markup-compatibility/2006" xmlns:r="http://schemas.openxmlformats.org/officeDocument/2006/relationships" xmlns:w="http://schemas.openxmlformats.org/wordprocessingml/2006/main" xmlns:w14="http://schemas.microsoft.com/office/word/2010/wordml" mc:Ignorable="w14">
-  <w:font w:name="Wingdings">
-    <w:panose1 w:val="05000000000000000000"/>
-    <w:charset w:val="02"/>
-    <w:family w:val="auto"/>
-    <w:pitch w:val="variable"/>
-    <w:sig w:usb0="00000000" w:usb1="10000000" w:usb2="00000000" w:usb3="00000000" w:csb0="80000000" w:csb1="00000000"/>
-  </w:font>
-  <w:font w:name="Times New Roman">
-    <w:panose1 w:val="02020603050405020304"/>
-    <w:charset w:val="00"/>
-    <w:family w:val="roman"/>
-    <w:pitch w:val="variable"/>
-    <w:sig w:usb0="E0002EFF" w:usb1="C000785B" w:usb2="00000009" w:usb3="00000000" w:csb0="000001FF" w:csb1="00000000"/>
-  </w:font>
-  <w:font w:name="SutonnyMJ">
-    <w:panose1 w:val="00000000000000000000"/>
-    <w:charset w:val="00"/>
-    <w:family w:val="auto"/>
-    <w:pitch w:val="variable"/>
-    <w:sig w:usb0="80000AAF" w:usb1="00000048" w:usb2="00000000" w:usb3="00000000" w:csb0="0000003F" w:csb1="00000000"/>
-  </w:font>
-  <w:font w:name="Courier New">
-    <w:panose1 w:val="02070309020205020404"/>
-    <w:charset w:val="00"/>
-    <w:family w:val="modern"/>
-    <w:pitch w:val="fixed"/>
-    <w:sig w:usb0="E0002EFF" w:usb1="C0007843" w:usb2="00000009" w:usb3="00000000" w:csb0="000001FF" w:csb1="00000000"/>
-  </w:font>
-  <w:font w:name="Symbol">
-    <w:panose1 w:val="05050102010706020507"/>
-    <w:charset w:val="02"/>
-    <w:family w:val="roman"/>
-    <w:pitch w:val="variable"/>
-    <w:sig w:usb0="00000000" w:usb1="10000000" w:usb2="00000000" w:usb3="00000000" w:csb0="80000000" w:csb1="00000000"/>
-  </w:font>
-  <w:font w:name="Calibri">
-    <w:panose1 w:val="020F0502020204030204"/>
-    <w:charset w:val="00"/>
-    <w:family w:val="swiss"/>
-    <w:pitch w:val="variable"/>
-    <w:sig w:usb0="E4002EFF" w:usb1="C200247B" w:usb2="00000009" w:usb3="00000000" w:csb0="000001FF" w:csb1="00000000"/>
-  </w:font>
-  <w:font w:name="Cambria">
-    <w:panose1 w:val="02040503050406030204"/>
-    <w:charset w:val="00"/>
-    <w:family w:val="roman"/>
-    <w:pitch w:val="variable"/>
-    <w:sig w:usb0="E00006FF" w:usb1="420024FF" w:usb2="02000000" w:usb3="00000000" w:csb0="0000019F" w:csb1="00000000"/>
-  </w:font>
-  <w:font w:name="Tahoma">
-    <w:panose1 w:val="020B0604030504040204"/>
-    <w:charset w:val="00"/>
-    <w:family w:val="swiss"/>
-    <w:pitch w:val="variable"/>
-    <w:sig w:usb0="E1002EFF" w:usb1="C000605B" w:usb2="00000029" w:usb3="00000000" w:csb0="000101FF" w:csb1="00000000"/>
-  </w:font>
-</w:fonts>
-</file>
-
-<file path=word/glossary/settings.xml><?xml version="1.0" encoding="utf-8"?>
-<w:settings xmlns:mc="http://schemas.openxmlformats.org/markup-compatibility/2006" xmlns:o="urn:schemas-microsoft-com:office:office" xmlns:r="http://schemas.openxmlformats.org/officeDocument/2006/relationships" xmlns:m="http://schemas.openxmlformats.org/officeDocument/2006/math" xmlns:v="urn:schemas-microsoft-com:vml" xmlns:w10="urn:schemas-microsoft-com:office:word" xmlns:w="http://schemas.openxmlformats.org/wordprocessingml/2006/main" xmlns:w14="http://schemas.microsoft.com/office/word/2010/wordml" xmlns:sl="http://schemas.openxmlformats.org/schemaLibrary/2006/main" mc:Ignorable="w14">
-  <w:view w:val="normal"/>
-  <w:defaultTabStop w:val="720"/>
-  <w:characterSpacingControl w:val="doNotCompress"/>
-  <w:compat>
-    <w:useFELayout/>
-    <w:compatSetting w:name="compatibilityMode" w:uri="http://schemas.microsoft.com/office/word" w:val="14"/>
-    <w:compatSetting w:name="overrideTableStyleFontSizeAndJustification" w:uri="http://schemas.microsoft.com/office/word" w:val="1"/>
-    <w:compatSetting w:name="enableOpenTypeFeatures" w:uri="http://schemas.microsoft.com/office/word" w:val="1"/>
-    <w:compatSetting w:name="doNotFlipMirrorIndents" w:uri="http://schemas.microsoft.com/office/word" w:val="1"/>
-  </w:compat>
-  <w:rsids>
-    <w:rsidRoot w:val="009E05D3"/>
-    <w:rsid w:val="00461327"/>
-    <w:rsid w:val="009E05D3"/>
-  </w:rsids>
-  <m:mathPr>
-    <m:mathFont m:val="Cambria Math"/>
-    <m:brkBin m:val="before"/>
-    <m:brkBinSub m:val="--"/>
-    <m:smallFrac m:val="0"/>
-    <m:dispDef/>
-    <m:lMargin m:val="0"/>
-    <m:rMargin m:val="0"/>
-    <m:defJc m:val="centerGroup"/>
-    <m:wrapIndent m:val="1440"/>
-    <m:intLim m:val="subSup"/>
-    <m:naryLim m:val="undOvr"/>
-  </m:mathPr>
-  <w:themeFontLang w:val="en-US"/>
-  <w:clrSchemeMapping w:bg1="light1" w:t1="dark1" w:bg2="light2" w:t2="dark2" w:accent1="accent1" w:accent2="accent2" w:accent3="accent3" w:accent4="accent4" w:accent5="accent5" w:accent6="accent6" w:hyperlink="hyperlink" w:followedHyperlink="followedHyperlink"/>
-  <w:decimalSymbol w:val="."/>
-  <w:listSeparator w:val=","/>
-</w:settings>
-</file>
-
-<file path=word/glossary/styles.xml><?xml version="1.0" encoding="utf-8"?>
-<w:styles xmlns:mc="http://schemas.openxmlformats.org/markup-compatibility/2006" xmlns:r="http://schemas.openxmlformats.org/officeDocument/2006/relationships" xmlns:w="http://schemas.openxmlformats.org/wordprocessingml/2006/main" xmlns:w14="http://schemas.microsoft.com/office/word/2010/wordml" mc:Ignorable="w14">
-  <w:docDefaults>
-    <w:rPrDefault>
-      <w:rPr>
-        <w:rFonts w:asciiTheme="minorHAnsi" w:eastAsiaTheme="minorEastAsia" w:hAnsiTheme="minorHAnsi" w:cstheme="minorBidi"/>
-        <w:sz w:val="22"/>
-        <w:szCs w:val="22"/>
-        <w:lang w:val="en-US" w:eastAsia="en-US" w:bidi="ar-SA"/>
-      </w:rPr>
-    </w:rPrDefault>
-    <w:pPrDefault>
-      <w:pPr>
-        <w:spacing w:after="200" w:line="276" w:lineRule="auto"/>
-      </w:pPr>
-    </w:pPrDefault>
-  </w:docDefaults>
-  <w:latentStyles w:defLockedState="0" w:defUIPriority="99" w:defSemiHidden="1" w:defUnhideWhenUsed="1" w:defQFormat="0" w:count="267">
-    <w:lsdException w:name="Normal" w:semiHidden="0" w:uiPriority="0" w:unhideWhenUsed="0" w:qFormat="1"/>
-    <w:lsdException w:name="heading 1" w:semiHidden="0" w:uiPriority="9" w:unhideWhenUsed="0" w:qFormat="1"/>
-    <w:lsdException w:name="heading 2" w:uiPriority="9" w:qFormat="1"/>
-    <w:lsdException w:name="heading 3" w:uiPriority="9" w:qFormat="1"/>
-    <w:lsdException w:name="heading 4" w:uiPriority="9" w:qFormat="1"/>
-    <w:lsdException w:name="heading 5" w:uiPriority="9" w:qFormat="1"/>
-    <w:lsdException w:name="heading 6" w:uiPriority="9" w:qFormat="1"/>
-    <w:lsdException w:name="heading 7" w:uiPriority="9" w:qFormat="1"/>
-    <w:lsdException w:name="heading 8" w:uiPriority="9" w:qFormat="1"/>
-    <w:lsdException w:name="heading 9" w:uiPriority="9" w:qFormat="1"/>
-    <w:lsdException w:name="toc 1" w:uiPriority="39"/>
-    <w:lsdException w:name="toc 2" w:uiPriority="39"/>
-    <w:lsdException w:name="toc 3" w:uiPriority="39"/>
-    <w:lsdException w:name="toc 4" w:uiPriority="39"/>
-    <w:lsdException w:name="toc 5" w:uiPriority="39"/>
-    <w:lsdException w:name="toc 6" w:uiPriority="39"/>
-    <w:lsdException w:name="toc 7" w:uiPriority="39"/>
-    <w:lsdException w:name="toc 8" w:uiPriority="39"/>
-    <w:lsdException w:name="toc 9" w:uiPriority="39"/>
-    <w:lsdException w:name="caption" w:uiPriority="35" w:qFormat="1"/>
-    <w:lsdException w:name="Title" w:semiHidden="0" w:uiPriority="10" w:unhideWhenUsed="0" w:qFormat="1"/>
-    <w:lsdException w:name="Default Paragraph Font" w:uiPriority="1"/>
-    <w:lsdException w:name="Subtitle" w:semiHidden="0" w:uiPriority="11" w:unhideWhenUsed="0" w:qFormat="1"/>
-    <w:lsdException w:name="Strong" w:semiHidden="0" w:uiPriority="22" w:unhideWhenUsed="0" w:qFormat="1"/>
-    <w:lsdException w:name="Emphasis" w:semiHidden="0" w:uiPriority="20" w:unhideWhenUsed="0" w:qFormat="1"/>
-    <w:lsdException w:name="Table Grid" w:semiHidden="0" w:uiPriority="59" w:unhideWhenUsed="0"/>
-    <w:lsdException w:name="Placeholder Text" w:unhideWhenUsed="0"/>
-    <w:lsdException w:name="No Spacing" w:semiHidden="0" w:uiPriority="1" w:unhideWhenUsed="0" w:qFormat="1"/>
-    <w:lsdException w:name="Light Shading" w:semiHidden="0" w:uiPriority="60" w:unhideWhenUsed="0"/>
-    <w:lsdException w:name="Light List" w:semiHidden="0" w:uiPriority="61" w:unhideWhenUsed="0"/>
-    <w:lsdException w:name="Light Grid" w:semiHidden="0" w:uiPriority="62" w:unhideWhenUsed="0"/>
-    <w:lsdException w:name="Medium Shading 1" w:semiHidden="0" w:uiPriority="63" w:unhideWhenUsed="0"/>
-    <w:lsdException w:name="Medium Shading 2" w:semiHidden="0" w:uiPriority="64" w:unhideWhenUsed="0"/>
-    <w:lsdException w:name="Medium List 1" w:semiHidden="0" w:uiPriority="65" w:unhideWhenUsed="0"/>
-    <w:lsdException w:name="Medium List 2" w:semiHidden="0" w:uiPriority="66" w:unhideWhenUsed="0"/>
-    <w:lsdException w:name="Medium Grid 1" w:semiHidden="0" w:uiPriority="67" w:unhideWhenUsed="0"/>
-    <w:lsdException w:name="Medium Grid 2" w:semiHidden="0" w:uiPriority="68" w:unhideWhenUsed="0"/>
-    <w:lsdException w:name="Medium Grid 3" w:semiHidden="0" w:uiPriority="69" w:unhideWhenUsed="0"/>
-    <w:lsdException w:name="Dark List" w:semiHidden="0" w:uiPriority="70" w:unhideWhenUsed="0"/>
-    <w:lsdException w:name="Colorful Shading" w:semiHidden="0" w:uiPriority="71" w:unhideWhenUsed="0"/>
-    <w:lsdException w:name="Colorful List" w:semiHidden="0" w:uiPriority="72" w:unhideWhenUsed="0"/>
-    <w:lsdException w:name="Colorful Grid" w:semiHidden="0" w:uiPriority="73" w:unhideWhenUsed="0"/>
-    <w:lsdException w:name="Light Shading Accent 1" w:semiHidden="0" w:uiPriority="60" w:unhideWhenUsed="0"/>
-    <w:lsdException w:name="Light List Accent 1" w:semiHidden="0" w:uiPriority="61" w:unhideWhenUsed="0"/>
-    <w:lsdException w:name="Light Grid Accent 1" w:semiHidden="0" w:uiPriority="62" w:unhideWhenUsed="0"/>
-    <w:lsdException w:name="Medium Shading 1 Accent 1" w:semiHidden="0" w:uiPriority="63" w:unhideWhenUsed="0"/>
-    <w:lsdException w:name="Medium Shading 2 Accent 1" w:semiHidden="0" w:uiPriority="64" w:unhideWhenUsed="0"/>
-    <w:lsdException w:name="Medium List 1 Accent 1" w:semiHidden="0" w:uiPriority="65" w:unhideWhenUsed="0"/>
-    <w:lsdException w:name="Revision" w:unhideWhenUsed="0"/>
-    <w:lsdException w:name="List Paragraph" w:semiHidden="0" w:uiPriority="34" w:unhideWhenUsed="0" w:qFormat="1"/>
-    <w:lsdException w:name="Quote" w:semiHidden="0" w:uiPriority="29" w:unhideWhenUsed="0" w:qFormat="1"/>
-    <w:lsdException w:name="Intense Quote" w:semiHidden="0" w:uiPriority="30" w:unhideWhenUsed="0" w:qFormat="1"/>
-    <w:lsdException w:name="Medium List 2 Accent 1" w:semiHidden="0" w:uiPriority="66" w:unhideWhenUsed="0"/>
-    <w:lsdException w:name="Medium Grid 1 Accent 1" w:semiHidden="0" w:uiPriority="67" w:unhideWhenUsed="0"/>
-    <w:lsdException w:name="Medium Grid 2 Accent 1" w:semiHidden="0" w:uiPriority="68" w:unhideWhenUsed="0"/>
-    <w:lsdException w:name="Medium Grid 3 Accent 1" w:semiHidden="0" w:uiPriority="69" w:unhideWhenUsed="0"/>
-    <w:lsdException w:name="Dark List Accent 1" w:semiHidden="0" w:uiPriority="70" w:unhideWhenUsed="0"/>
-    <w:lsdException w:name="Colorful Shading Accent 1" w:semiHidden="0" w:uiPriority="71" w:unhideWhenUsed="0"/>
-    <w:lsdException w:name="Colorful List Accent 1" w:semiHidden="0" w:uiPriority="72" w:unhideWhenUsed="0"/>
-    <w:lsdException w:name="Colorful Grid Accent 1" w:semiHidden="0" w:uiPriority="73" w:unhideWhenUsed="0"/>
-    <w:lsdException w:name="Light Shading Accent 2" w:semiHidden="0" w:uiPriority="60" w:unhideWhenUsed="0"/>
-    <w:lsdException w:name="Light List Accent 2" w:semiHidden="0" w:uiPriority="61" w:unhideWhenUsed="0"/>
-    <w:lsdException w:name="Light Grid Accent 2" w:semiHidden="0" w:uiPriority="62" w:unhideWhenUsed="0"/>
-    <w:lsdException w:name="Medium Shading 1 Accent 2" w:semiHidden="0" w:uiPriority="63" w:unhideWhenUsed="0"/>
-    <w:lsdException w:name="Medium Shading 2 Accent 2" w:semiHidden="0" w:uiPriority="64" w:unhideWhenUsed="0"/>
-    <w:lsdException w:name="Medium List 1 Accent 2" w:semiHidden="0" w:uiPriority="65" w:unhideWhenUsed="0"/>
-    <w:lsdException w:name="Medium List 2 Accent 2" w:semiHidden="0" w:uiPriority="66" w:unhideWhenUsed="0"/>
-    <w:lsdException w:name="Medium Grid 1 Accent 2" w:semiHidden="0" w:uiPriority="67" w:unhideWhenUsed="0"/>
-    <w:lsdException w:name="Medium Grid 2 Accent 2" w:semiHidden="0" w:uiPriority="68" w:unhideWhenUsed="0"/>
-    <w:lsdException w:name="Medium Grid 3 Accent 2" w:semiHidden="0" w:uiPriority="69" w:unhideWhenUsed="0"/>
-    <w:lsdException w:name="Dark List Accent 2" w:semiHidden="0" w:uiPriority="70" w:unhideWhenUsed="0"/>
-    <w:lsdException w:name="Colorful Shading Accent 2" w:semiHidden="0" w:uiPriority="71" w:unhideWhenUsed="0"/>
-    <w:lsdException w:name="Colorful List Accent 2" w:semiHidden="0" w:uiPriority="72" w:unhideWhenUsed="0"/>
-    <w:lsdException w:name="Colorful Grid Accent 2" w:semiHidden="0" w:uiPriority="73" w:unhideWhenUsed="0"/>
-    <w:lsdException w:name="Light Shading Accent 3" w:semiHidden="0" w:uiPriority="60" w:unhideWhenUsed="0"/>
-    <w:lsdException w:name="Light List Accent 3" w:semiHidden="0" w:uiPriority="61" w:unhideWhenUsed="0"/>
-    <w:lsdException w:name="Light Grid Accent 3" w:semiHidden="0" w:uiPriority="62" w:unhideWhenUsed="0"/>
-    <w:lsdException w:name="Medium Shading 1 Accent 3" w:semiHidden="0" w:uiPriority="63" w:unhideWhenUsed="0"/>
-    <w:lsdException w:name="Medium Shading 2 Accent 3" w:semiHidden="0" w:uiPriority="64" w:unhideWhenUsed="0"/>
-    <w:lsdException w:name="Medium List 1 Accent 3" w:semiHidden="0" w:uiPriority="65" w:unhideWhenUsed="0"/>
-    <w:lsdException w:name="Medium List 2 Accent 3" w:semiHidden="0" w:uiPriority="66" w:unhideWhenUsed="0"/>
-    <w:lsdException w:name="Medium Grid 1 Accent 3" w:semiHidden="0" w:uiPriority="67" w:unhideWhenUsed="0"/>
-    <w:lsdException w:name="Medium Grid 2 Accent 3" w:semiHidden="0" w:uiPriority="68" w:unhideWhenUsed="0"/>
-    <w:lsdException w:name="Medium Grid 3 Accent 3" w:semiHidden="0" w:uiPriority="69" w:unhideWhenUsed="0"/>
-    <w:lsdException w:name="Dark List Accent 3" w:semiHidden="0" w:uiPriority="70" w:unhideWhenUsed="0"/>
-    <w:lsdException w:name="Colorful Shading Accent 3" w:semiHidden="0" w:uiPriority="71" w:unhideWhenUsed="0"/>
-    <w:lsdException w:name="Colorful List Accent 3" w:semiHidden="0" w:uiPriority="72" w:unhideWhenUsed="0"/>
-    <w:lsdException w:name="Colorful Grid Accent 3" w:semiHidden="0" w:uiPriority="73" w:unhideWhenUsed="0"/>
-    <w:lsdException w:name="Light Shading Accent 4" w:semiHidden="0" w:uiPriority="60" w:unhideWhenUsed="0"/>
-    <w:lsdException w:name="Light List Accent 4" w:semiHidden="0" w:uiPriority="61" w:unhideWhenUsed="0"/>
-    <w:lsdException w:name="Light Grid Accent 4" w:semiHidden="0" w:uiPriority="62" w:unhideWhenUsed="0"/>
-    <w:lsdException w:name="Medium Shading 1 Accent 4" w:semiHidden="0" w:uiPriority="63" w:unhideWhenUsed="0"/>
-    <w:lsdException w:name="Medium Shading 2 Accent 4" w:semiHidden="0" w:uiPriority="64" w:unhideWhenUsed="0"/>
-    <w:lsdException w:name="Medium List 1 Accent 4" w:semiHidden="0" w:uiPriority="65" w:unhideWhenUsed="0"/>
-    <w:lsdException w:name="Medium List 2 Accent 4" w:semiHidden="0" w:uiPriority="66" w:unhideWhenUsed="0"/>
-    <w:lsdException w:name="Medium Grid 1 Accent 4" w:semiHidden="0" w:uiPriority="67" w:unhideWhenUsed="0"/>
-    <w:lsdException w:name="Medium Grid 2 Accent 4" w:semiHidden="0" w:uiPriority="68" w:unhideWhenUsed="0"/>
-    <w:lsdException w:name="Medium Grid 3 Accent 4" w:semiHidden="0" w:uiPriority="69" w:unhideWhenUsed="0"/>
-    <w:lsdException w:name="Dark List Accent 4" w:semiHidden="0" w:uiPriority="70" w:unhideWhenUsed="0"/>
-    <w:lsdException w:name="Colorful Shading Accent 4" w:semiHidden="0" w:uiPriority="71" w:unhideWhenUsed="0"/>
-    <w:lsdException w:name="Colorful List Accent 4" w:semiHidden="0" w:uiPriority="72" w:unhideWhenUsed="0"/>
-    <w:lsdException w:name="Colorful Grid Accent 4" w:semiHidden="0" w:uiPriority="73" w:unhideWhenUsed="0"/>
-    <w:lsdException w:name="Light Shading Accent 5" w:semiHidden="0" w:uiPriority="60" w:unhideWhenUsed="0"/>
-    <w:lsdException w:name="Light List Accent 5" w:semiHidden="0" w:uiPriority="61" w:unhideWhenUsed="0"/>
-    <w:lsdException w:name="Light Grid Accent 5" w:semiHidden="0" w:uiPriority="62" w:unhideWhenUsed="0"/>
-    <w:lsdException w:name="Medium Shading 1 Accent 5" w:semiHidden="0" w:uiPriority="63" w:unhideWhenUsed="0"/>
-    <w:lsdException w:name="Medium Shading 2 Accent 5" w:semiHidden="0" w:uiPriority="64" w:unhideWhenUsed="0"/>
-    <w:lsdException w:name="Medium List 1 Accent 5" w:semiHidden="0" w:uiPriority="65" w:unhideWhenUsed="0"/>
-    <w:lsdException w:name="Medium List 2 Accent 5" w:semiHidden="0" w:uiPriority="66" w:unhideWhenUsed="0"/>
-    <w:lsdException w:name="Medium Grid 1 Accent 5" w:semiHidden="0" w:uiPriority="67" w:unhideWhenUsed="0"/>
-    <w:lsdException w:name="Medium Grid 2 Accent 5" w:semiHidden="0" w:uiPriority="68" w:unhideWhenUsed="0"/>
-    <w:lsdException w:name="Medium Grid 3 Accent 5" w:semiHidden="0" w:uiPriority="69" w:unhideWhenUsed="0"/>
-    <w:lsdException w:name="Dark List Accent 5" w:semiHidden="0" w:uiPriority="70" w:unhideWhenUsed="0"/>
-    <w:lsdException w:name="Colorful Shading Accent 5" w:semiHidden="0" w:uiPriority="71" w:unhideWhenUsed="0"/>
-    <w:lsdException w:name="Colorful List Accent 5" w:semiHidden="0" w:uiPriority="72" w:unhideWhenUsed="0"/>
-    <w:lsdException w:name="Colorful Grid Accent 5" w:semiHidden="0" w:uiPriority="73" w:unhideWhenUsed="0"/>
-    <w:lsdException w:name="Light Shading Accent 6" w:semiHidden="0" w:uiPriority="60" w:unhideWhenUsed="0"/>
-    <w:lsdException w:name="Light List Accent 6" w:semiHidden="0" w:uiPriority="61" w:unhideWhenUsed="0"/>
-    <w:lsdException w:name="Light Grid Accent 6" w:semiHidden="0" w:uiPriority="62" w:unhideWhenUsed="0"/>
-    <w:lsdException w:name="Medium Shading 1 Accent 6" w:semiHidden="0" w:uiPriority="63" w:unhideWhenUsed="0"/>
-    <w:lsdException w:name="Medium Shading 2 Accent 6" w:semiHidden="0" w:uiPriority="64" w:unhideWhenUsed="0"/>
-    <w:lsdException w:name="Medium List 1 Accent 6" w:semiHidden="0" w:uiPriority="65" w:unhideWhenUsed="0"/>
-    <w:lsdException w:name="Medium List 2 Accent 6" w:semiHidden="0" w:uiPriority="66" w:unhideWhenUsed="0"/>
-    <w:lsdException w:name="Medium Grid 1 Accent 6" w:semiHidden="0" w:uiPriority="67" w:unhideWhenUsed="0"/>
-    <w:lsdException w:name="Medium Grid 2 Accent 6" w:semiHidden="0" w:uiPriority="68" w:unhideWhenUsed="0"/>
-    <w:lsdException w:name="Medium Grid 3 Accent 6" w:semiHidden="0" w:uiPriority="69" w:unhideWhenUsed="0"/>
-    <w:lsdException w:name="Dark List Accent 6" w:semiHidden="0" w:uiPriority="70" w:unhideWhenUsed="0"/>
-    <w:lsdException w:name="Colorful Shading Accent 6" w:semiHidden="0" w:uiPriority="71" w:unhideWhenUsed="0"/>
-    <w:lsdException w:name="Colorful List Accent 6" w:semiHidden="0" w:uiPriority="72" w:unhideWhenUsed="0"/>
-    <w:lsdException w:name="Colorful Grid Accent 6" w:semiHidden="0" w:uiPriority="73" w:unhideWhenUsed="0"/>
-    <w:lsdException w:name="Subtle Emphasis" w:semiHidden="0" w:uiPriority="19" w:unhideWhenUsed="0" w:qFormat="1"/>
-    <w:lsdException w:name="Intense Emphasis" w:semiHidden="0" w:uiPriority="21" w:unhideWhenUsed="0" w:qFormat="1"/>
-    <w:lsdException w:name="Subtle Reference" w:semiHidden="0" w:uiPriority="31" w:unhideWhenUsed="0" w:qFormat="1"/>
-    <w:lsdException w:name="Intense Reference" w:semiHidden="0" w:uiPriority="32" w:unhideWhenUsed="0" w:qFormat="1"/>
-    <w:lsdException w:name="Book Title" w:semiHidden="0" w:uiPriority="33" w:unhideWhenUsed="0" w:qFormat="1"/>
-    <w:lsdException w:name="Bibliography" w:uiPriority="37"/>
-    <w:lsdException w:name="TOC Heading" w:uiPriority="39" w:qFormat="1"/>
-  </w:latentStyles>
-  <w:style w:type="paragraph" w:default="1" w:styleId="Normal">
-    <w:name w:val="Normal"/>
-    <w:qFormat/>
-  </w:style>
-  <w:style w:type="character" w:default="1" w:styleId="DefaultParagraphFont">
-    <w:name w:val="Default Paragraph Font"/>
-    <w:uiPriority w:val="1"/>
-    <w:semiHidden/>
-    <w:unhideWhenUsed/>
-  </w:style>
-  <w:style w:type="table" w:default="1" w:styleId="TableNormal">
-    <w:name w:val="Normal Table"/>
-    <w:uiPriority w:val="99"/>
-    <w:semiHidden/>
-    <w:unhideWhenUsed/>
-    <w:tblPr>
-      <w:tblInd w:w="0" w:type="dxa"/>
-      <w:tblCellMar>
-        <w:top w:w="0" w:type="dxa"/>
-        <w:left w:w="108" w:type="dxa"/>
-        <w:bottom w:w="0" w:type="dxa"/>
-        <w:right w:w="108" w:type="dxa"/>
-      </w:tblCellMar>
-    </w:tblPr>
-  </w:style>
-  <w:style w:type="numbering" w:default="1" w:styleId="NoList">
-    <w:name w:val="No List"/>
-    <w:uiPriority w:val="99"/>
-    <w:semiHidden/>
-    <w:unhideWhenUsed/>
-  </w:style>
-  <w:style w:type="paragraph" w:customStyle="1" w:styleId="F2B73C00141344719106BE3752158BBA">
-    <w:name w:val="F2B73C00141344719106BE3752158BBA"/>
-    <w:rsid w:val="009E05D3"/>
-  </w:style>
-  <w:style w:type="paragraph" w:customStyle="1" w:styleId="3FDA9190EE2B406CB3D7EC8E271F31FC">
-    <w:name w:val="3FDA9190EE2B406CB3D7EC8E271F31FC"/>
-    <w:rsid w:val="009E05D3"/>
-  </w:style>
-  <w:style w:type="paragraph" w:customStyle="1" w:styleId="EF13FA9615DC4740BCC4E4E8594AE89C">
-    <w:name w:val="EF13FA9615DC4740BCC4E4E8594AE89C"/>
-    <w:rsid w:val="009E05D3"/>
-  </w:style>
-  <w:style w:type="paragraph" w:customStyle="1" w:styleId="EA3CFC8E6FBA4D64AA3B0BDC1BE34D70">
-    <w:name w:val="EA3CFC8E6FBA4D64AA3B0BDC1BE34D70"/>
-    <w:rsid w:val="009E05D3"/>
-  </w:style>
-  <w:style w:type="paragraph" w:customStyle="1" w:styleId="2B1B20FA1C7B4BF8BE8A3A30CEFF7012">
-    <w:name w:val="2B1B20FA1C7B4BF8BE8A3A30CEFF7012"/>
-    <w:rsid w:val="009E05D3"/>
-  </w:style>
-  <w:style w:type="paragraph" w:customStyle="1" w:styleId="DA364398378E4C64B6738EFA471366CE">
-    <w:name w:val="DA364398378E4C64B6738EFA471366CE"/>
-    <w:rsid w:val="009E05D3"/>
-  </w:style>
-</w:styles>
-</file>
-
-<file path=word/glossary/stylesWithEffects.xml><?xml version="1.0" encoding="utf-8"?>
-<w:styles xmlns:wpc="http://schemas.microsoft.com/office/word/2010/wordprocessingCanvas" xmlns:mc="http://schemas.openxmlformats.org/markup-compatibility/2006" xmlns:o="urn:schemas-microsoft-com:office:office" xmlns:r="http://schemas.openxmlformats.org/officeDocument/2006/relationships" xmlns:m="http://schemas.openxmlformats.org/officeDocument/2006/math" xmlns:v="urn:schemas-microsoft-com:vml" xmlns:wp14="http://schemas.microsoft.com/office/word/2010/wordprocessingDrawing" xmlns:wp="http://schemas.openxmlformats.org/drawingml/2006/wordprocessingDrawing" xmlns:w10="urn:schemas-microsoft-com:office:word" xmlns:w="http://schemas.openxmlformats.org/wordprocessingml/2006/main" xmlns:w14="http://schemas.microsoft.com/office/word/2010/wordml" xmlns:wpg="http://schemas.microsoft.com/office/word/2010/wordprocessingGroup" xmlns:wpi="http://schemas.microsoft.com/office/word/2010/wordprocessingInk" xmlns:wne="http://schemas.microsoft.com/office/word/2006/wordml" xmlns:wps="http://schemas.microsoft.com/office/word/2010/wordprocessingShape" mc:Ignorable="w14 wp14">
-  <w:docDefaults>
-    <w:rPrDefault>
-      <w:rPr>
-        <w:rFonts w:asciiTheme="minorHAnsi" w:eastAsiaTheme="minorEastAsia" w:hAnsiTheme="minorHAnsi" w:cstheme="minorBidi"/>
-        <w:sz w:val="22"/>
-        <w:szCs w:val="22"/>
-        <w:lang w:val="en-US" w:eastAsia="en-US" w:bidi="ar-SA"/>
-      </w:rPr>
-    </w:rPrDefault>
-    <w:pPrDefault>
-      <w:pPr>
-        <w:spacing w:after="200" w:line="276" w:lineRule="auto"/>
-      </w:pPr>
-    </w:pPrDefault>
-  </w:docDefaults>
-  <w:latentStyles w:defLockedState="0" w:defUIPriority="99" w:defSemiHidden="1" w:defUnhideWhenUsed="1" w:defQFormat="0" w:count="267">
-    <w:lsdException w:name="Normal" w:semiHidden="0" w:uiPriority="0" w:unhideWhenUsed="0" w:qFormat="1"/>
-    <w:lsdException w:name="heading 1" w:semiHidden="0" w:uiPriority="9" w:unhideWhenUsed="0" w:qFormat="1"/>
-    <w:lsdException w:name="heading 2" w:uiPriority="9" w:qFormat="1"/>
-    <w:lsdException w:name="heading 3" w:uiPriority="9" w:qFormat="1"/>
-    <w:lsdException w:name="heading 4" w:uiPriority="9" w:qFormat="1"/>
-    <w:lsdException w:name="heading 5" w:uiPriority="9" w:qFormat="1"/>
-    <w:lsdException w:name="heading 6" w:uiPriority="9" w:qFormat="1"/>
-    <w:lsdException w:name="heading 7" w:uiPriority="9" w:qFormat="1"/>
-    <w:lsdException w:name="heading 8" w:uiPriority="9" w:qFormat="1"/>
-    <w:lsdException w:name="heading 9" w:uiPriority="9" w:qFormat="1"/>
-    <w:lsdException w:name="toc 1" w:uiPriority="39"/>
-    <w:lsdException w:name="toc 2" w:uiPriority="39"/>
-    <w:lsdException w:name="toc 3" w:uiPriority="39"/>
-    <w:lsdException w:name="toc 4" w:uiPriority="39"/>
-    <w:lsdException w:name="toc 5" w:uiPriority="39"/>
-    <w:lsdException w:name="toc 6" w:uiPriority="39"/>
-    <w:lsdException w:name="toc 7" w:uiPriority="39"/>
-    <w:lsdException w:name="toc 8" w:uiPriority="39"/>
-    <w:lsdException w:name="toc 9" w:uiPriority="39"/>
-    <w:lsdException w:name="caption" w:uiPriority="35" w:qFormat="1"/>
-    <w:lsdException w:name="Title" w:semiHidden="0" w:uiPriority="10" w:unhideWhenUsed="0" w:qFormat="1"/>
-    <w:lsdException w:name="Default Paragraph Font" w:uiPriority="1"/>
-    <w:lsdException w:name="Subtitle" w:semiHidden="0" w:uiPriority="11" w:unhideWhenUsed="0" w:qFormat="1"/>
-    <w:lsdException w:name="Strong" w:semiHidden="0" w:uiPriority="22" w:unhideWhenUsed="0" w:qFormat="1"/>
-    <w:lsdException w:name="Emphasis" w:semiHidden="0" w:uiPriority="20" w:unhideWhenUsed="0" w:qFormat="1"/>
-    <w:lsdException w:name="Table Grid" w:semiHidden="0" w:uiPriority="59" w:unhideWhenUsed="0"/>
-    <w:lsdException w:name="Placeholder Text" w:unhideWhenUsed="0"/>
-    <w:lsdException w:name="No Spacing" w:semiHidden="0" w:uiPriority="1" w:unhideWhenUsed="0" w:qFormat="1"/>
-    <w:lsdException w:name="Light Shading" w:semiHidden="0" w:uiPriority="60" w:unhideWhenUsed="0"/>
-    <w:lsdException w:name="Light List" w:semiHidden="0" w:uiPriority="61" w:unhideWhenUsed="0"/>
-    <w:lsdException w:name="Light Grid" w:semiHidden="0" w:uiPriority="62" w:unhideWhenUsed="0"/>
-    <w:lsdException w:name="Medium Shading 1" w:semiHidden="0" w:uiPriority="63" w:unhideWhenUsed="0"/>
-    <w:lsdException w:name="Medium Shading 2" w:semiHidden="0" w:uiPriority="64" w:unhideWhenUsed="0"/>
-    <w:lsdException w:name="Medium List 1" w:semiHidden="0" w:uiPriority="65" w:unhideWhenUsed="0"/>
-    <w:lsdException w:name="Medium List 2" w:semiHidden="0" w:uiPriority="66" w:unhideWhenUsed="0"/>
-    <w:lsdException w:name="Medium Grid 1" w:semiHidden="0" w:uiPriority="67" w:unhideWhenUsed="0"/>
-    <w:lsdException w:name="Medium Grid 2" w:semiHidden="0" w:uiPriority="68" w:unhideWhenUsed="0"/>
-    <w:lsdException w:name="Medium Grid 3" w:semiHidden="0" w:uiPriority="69" w:unhideWhenUsed="0"/>
-    <w:lsdException w:name="Dark List" w:semiHidden="0" w:uiPriority="70" w:unhideWhenUsed="0"/>
-    <w:lsdException w:name="Colorful Shading" w:semiHidden="0" w:uiPriority="71" w:unhideWhenUsed="0"/>
-    <w:lsdException w:name="Colorful List" w:semiHidden="0" w:uiPriority="72" w:unhideWhenUsed="0"/>
-    <w:lsdException w:name="Colorful Grid" w:semiHidden="0" w:uiPriority="73" w:unhideWhenUsed="0"/>
-    <w:lsdException w:name="Light Shading Accent 1" w:semiHidden="0" w:uiPriority="60" w:unhideWhenUsed="0"/>
-    <w:lsdException w:name="Light List Accent 1" w:semiHidden="0" w:uiPriority="61" w:unhideWhenUsed="0"/>
-    <w:lsdException w:name="Light Grid Accent 1" w:semiHidden="0" w:uiPriority="62" w:unhideWhenUsed="0"/>
-    <w:lsdException w:name="Medium Shading 1 Accent 1" w:semiHidden="0" w:uiPriority="63" w:unhideWhenUsed="0"/>
-    <w:lsdException w:name="Medium Shading 2 Accent 1" w:semiHidden="0" w:uiPriority="64" w:unhideWhenUsed="0"/>
-    <w:lsdException w:name="Medium List 1 Accent 1" w:semiHidden="0" w:uiPriority="65" w:unhideWhenUsed="0"/>
-    <w:lsdException w:name="Revision" w:unhideWhenUsed="0"/>
-    <w:lsdException w:name="List Paragraph" w:semiHidden="0" w:uiPriority="34" w:unhideWhenUsed="0" w:qFormat="1"/>
-    <w:lsdException w:name="Quote" w:semiHidden="0" w:uiPriority="29" w:unhideWhenUsed="0" w:qFormat="1"/>
-    <w:lsdException w:name="Intense Quote" w:semiHidden="0" w:uiPriority="30" w:unhideWhenUsed="0" w:qFormat="1"/>
-    <w:lsdException w:name="Medium List 2 Accent 1" w:semiHidden="0" w:uiPriority="66" w:unhideWhenUsed="0"/>
-    <w:lsdException w:name="Medium Grid 1 Accent 1" w:semiHidden="0" w:uiPriority="67" w:unhideWhenUsed="0"/>
-    <w:lsdException w:name="Medium Grid 2 Accent 1" w:semiHidden="0" w:uiPriority="68" w:unhideWhenUsed="0"/>
-    <w:lsdException w:name="Medium Grid 3 Accent 1" w:semiHidden="0" w:uiPriority="69" w:unhideWhenUsed="0"/>
-    <w:lsdException w:name="Dark List Accent 1" w:semiHidden="0" w:uiPriority="70" w:unhideWhenUsed="0"/>
-    <w:lsdException w:name="Colorful Shading Accent 1" w:semiHidden="0" w:uiPriority="71" w:unhideWhenUsed="0"/>
-    <w:lsdException w:name="Colorful List Accent 1" w:semiHidden="0" w:uiPriority="72" w:unhideWhenUsed="0"/>
-    <w:lsdException w:name="Colorful Grid Accent 1" w:semiHidden="0" w:uiPriority="73" w:unhideWhenUsed="0"/>
-    <w:lsdException w:name="Light Shading Accent 2" w:semiHidden="0" w:uiPriority="60" w:unhideWhenUsed="0"/>
-    <w:lsdException w:name="Light List Accent 2" w:semiHidden="0" w:uiPriority="61" w:unhideWhenUsed="0"/>
-    <w:lsdException w:name="Light Grid Accent 2" w:semiHidden="0" w:uiPriority="62" w:unhideWhenUsed="0"/>
-    <w:lsdException w:name="Medium Shading 1 Accent 2" w:semiHidden="0" w:uiPriority="63" w:unhideWhenUsed="0"/>
-    <w:lsdException w:name="Medium Shading 2 Accent 2" w:semiHidden="0" w:uiPriority="64" w:unhideWhenUsed="0"/>
-    <w:lsdException w:name="Medium List 1 Accent 2" w:semiHidden="0" w:uiPriority="65" w:unhideWhenUsed="0"/>
-    <w:lsdException w:name="Medium List 2 Accent 2" w:semiHidden="0" w:uiPriority="66" w:unhideWhenUsed="0"/>
-    <w:lsdException w:name="Medium Grid 1 Accent 2" w:semiHidden="0" w:uiPriority="67" w:unhideWhenUsed="0"/>
-    <w:lsdException w:name="Medium Grid 2 Accent 2" w:semiHidden="0" w:uiPriority="68" w:unhideWhenUsed="0"/>
-    <w:lsdException w:name="Medium Grid 3 Accent 2" w:semiHidden="0" w:uiPriority="69" w:unhideWhenUsed="0"/>
-    <w:lsdException w:name="Dark List Accent 2" w:semiHidden="0" w:uiPriority="70" w:unhideWhenUsed="0"/>
-    <w:lsdException w:name="Colorful Shading Accent 2" w:semiHidden="0" w:uiPriority="71" w:unhideWhenUsed="0"/>
-    <w:lsdException w:name="Colorful List Accent 2" w:semiHidden="0" w:uiPriority="72" w:unhideWhenUsed="0"/>
-    <w:lsdException w:name="Colorful Grid Accent 2" w:semiHidden="0" w:uiPriority="73" w:unhideWhenUsed="0"/>
-    <w:lsdException w:name="Light Shading Accent 3" w:semiHidden="0" w:uiPriority="60" w:unhideWhenUsed="0"/>
-    <w:lsdException w:name="Light List Accent 3" w:semiHidden="0" w:uiPriority="61" w:unhideWhenUsed="0"/>
-    <w:lsdException w:name="Light Grid Accent 3" w:semiHidden="0" w:uiPriority="62" w:unhideWhenUsed="0"/>
-    <w:lsdException w:name="Medium Shading 1 Accent 3" w:semiHidden="0" w:uiPriority="63" w:unhideWhenUsed="0"/>
-    <w:lsdException w:name="Medium Shading 2 Accent 3" w:semiHidden="0" w:uiPriority="64" w:unhideWhenUsed="0"/>
-    <w:lsdException w:name="Medium List 1 Accent 3" w:semiHidden="0" w:uiPriority="65" w:unhideWhenUsed="0"/>
-    <w:lsdException w:name="Medium List 2 Accent 3" w:semiHidden="0" w:uiPriority="66" w:unhideWhenUsed="0"/>
-    <w:lsdException w:name="Medium Grid 1 Accent 3" w:semiHidden="0" w:uiPriority="67" w:unhideWhenUsed="0"/>
-    <w:lsdException w:name="Medium Grid 2 Accent 3" w:semiHidden="0" w:uiPriority="68" w:unhideWhenUsed="0"/>
-    <w:lsdException w:name="Medium Grid 3 Accent 3" w:semiHidden="0" w:uiPriority="69" w:unhideWhenUsed="0"/>
-    <w:lsdException w:name="Dark List Accent 3" w:semiHidden="0" w:uiPriority="70" w:unhideWhenUsed="0"/>
-    <w:lsdException w:name="Colorful Shading Accent 3" w:semiHidden="0" w:uiPriority="71" w:unhideWhenUsed="0"/>
-    <w:lsdException w:name="Colorful List Accent 3" w:semiHidden="0" w:uiPriority="72" w:unhideWhenUsed="0"/>
-    <w:lsdException w:name="Colorful Grid Accent 3" w:semiHidden="0" w:uiPriority="73" w:unhideWhenUsed="0"/>
-    <w:lsdException w:name="Light Shading Accent 4" w:semiHidden="0" w:uiPriority="60" w:unhideWhenUsed="0"/>
-    <w:lsdException w:name="Light List Accent 4" w:semiHidden="0" w:uiPriority="61" w:unhideWhenUsed="0"/>
-    <w:lsdException w:name="Light Grid Accent 4" w:semiHidden="0" w:uiPriority="62" w:unhideWhenUsed="0"/>
-    <w:lsdException w:name="Medium Shading 1 Accent 4" w:semiHidden="0" w:uiPriority="63" w:unhideWhenUsed="0"/>
-    <w:lsdException w:name="Medium Shading 2 Accent 4" w:semiHidden="0" w:uiPriority="64" w:unhideWhenUsed="0"/>
-    <w:lsdException w:name="Medium List 1 Accent 4" w:semiHidden="0" w:uiPriority="65" w:unhideWhenUsed="0"/>
-    <w:lsdException w:name="Medium List 2 Accent 4" w:semiHidden="0" w:uiPriority="66" w:unhideWhenUsed="0"/>
-    <w:lsdException w:name="Medium Grid 1 Accent 4" w:semiHidden="0" w:uiPriority="67" w:unhideWhenUsed="0"/>
-    <w:lsdException w:name="Medium Grid 2 Accent 4" w:semiHidden="0" w:uiPriority="68" w:unhideWhenUsed="0"/>
-    <w:lsdException w:name="Medium Grid 3 Accent 4" w:semiHidden="0" w:uiPriority="69" w:unhideWhenUsed="0"/>
-    <w:lsdException w:name="Dark List Accent 4" w:semiHidden="0" w:uiPriority="70" w:unhideWhenUsed="0"/>
-    <w:lsdException w:name="Colorful Shading Accent 4" w:semiHidden="0" w:uiPriority="71" w:unhideWhenUsed="0"/>
-    <w:lsdException w:name="Colorful List Accent 4" w:semiHidden="0" w:uiPriority="72" w:unhideWhenUsed="0"/>
-    <w:lsdException w:name="Colorful Grid Accent 4" w:semiHidden="0" w:uiPriority="73" w:unhideWhenUsed="0"/>
-    <w:lsdException w:name="Light Shading Accent 5" w:semiHidden="0" w:uiPriority="60" w:unhideWhenUsed="0"/>
-    <w:lsdException w:name="Light List Accent 5" w:semiHidden="0" w:uiPriority="61" w:unhideWhenUsed="0"/>
-    <w:lsdException w:name="Light Grid Accent 5" w:semiHidden="0" w:uiPriority="62" w:unhideWhenUsed="0"/>
-    <w:lsdException w:name="Medium Shading 1 Accent 5" w:semiHidden="0" w:uiPriority="63" w:unhideWhenUsed="0"/>
-    <w:lsdException w:name="Medium Shading 2 Accent 5" w:semiHidden="0" w:uiPriority="64" w:unhideWhenUsed="0"/>
-    <w:lsdException w:name="Medium List 1 Accent 5" w:semiHidden="0" w:uiPriority="65" w:unhideWhenUsed="0"/>
-    <w:lsdException w:name="Medium List 2 Accent 5" w:semiHidden="0" w:uiPriority="66" w:unhideWhenUsed="0"/>
-    <w:lsdException w:name="Medium Grid 1 Accent 5" w:semiHidden="0" w:uiPriority="67" w:unhideWhenUsed="0"/>
-    <w:lsdException w:name="Medium Grid 2 Accent 5" w:semiHidden="0" w:uiPriority="68" w:unhideWhenUsed="0"/>
-    <w:lsdException w:name="Medium Grid 3 Accent 5" w:semiHidden="0" w:uiPriority="69" w:unhideWhenUsed="0"/>
-    <w:lsdException w:name="Dark List Accent 5" w:semiHidden="0" w:uiPriority="70" w:unhideWhenUsed="0"/>
-    <w:lsdException w:name="Colorful Shading Accent 5" w:semiHidden="0" w:uiPriority="71" w:unhideWhenUsed="0"/>
-    <w:lsdException w:name="Colorful List Accent 5" w:semiHidden="0" w:uiPriority="72" w:unhideWhenUsed="0"/>
-    <w:lsdException w:name="Colorful Grid Accent 5" w:semiHidden="0" w:uiPriority="73" w:unhideWhenUsed="0"/>
-    <w:lsdException w:name="Light Shading Accent 6" w:semiHidden="0" w:uiPriority="60" w:unhideWhenUsed="0"/>
-    <w:lsdException w:name="Light List Accent 6" w:semiHidden="0" w:uiPriority="61" w:unhideWhenUsed="0"/>
-    <w:lsdException w:name="Light Grid Accent 6" w:semiHidden="0" w:uiPriority="62" w:unhideWhenUsed="0"/>
-    <w:lsdException w:name="Medium Shading 1 Accent 6" w:semiHidden="0" w:uiPriority="63" w:unhideWhenUsed="0"/>
-    <w:lsdException w:name="Medium Shading 2 Accent 6" w:semiHidden="0" w:uiPriority="64" w:unhideWhenUsed="0"/>
-    <w:lsdException w:name="Medium List 1 Accent 6" w:semiHidden="0" w:uiPriority="65" w:unhideWhenUsed="0"/>
-    <w:lsdException w:name="Medium List 2 Accent 6" w:semiHidden="0" w:uiPriority="66" w:unhideWhenUsed="0"/>
-    <w:lsdException w:name="Medium Grid 1 Accent 6" w:semiHidden="0" w:uiPriority="67" w:unhideWhenUsed="0"/>
-    <w:lsdException w:name="Medium Grid 2 Accent 6" w:semiHidden="0" w:uiPriority="68" w:unhideWhenUsed="0"/>
-    <w:lsdException w:name="Medium Grid 3 Accent 6" w:semiHidden="0" w:uiPriority="69" w:unhideWhenUsed="0"/>
-    <w:lsdException w:name="Dark List Accent 6" w:semiHidden="0" w:uiPriority="70" w:unhideWhenUsed="0"/>
-    <w:lsdException w:name="Colorful Shading Accent 6" w:semiHidden="0" w:uiPriority="71" w:unhideWhenUsed="0"/>
-    <w:lsdException w:name="Colorful List Accent 6" w:semiHidden="0" w:uiPriority="72" w:unhideWhenUsed="0"/>
-    <w:lsdException w:name="Colorful Grid Accent 6" w:semiHidden="0" w:uiPriority="73" w:unhideWhenUsed="0"/>
-    <w:lsdException w:name="Subtle Emphasis" w:semiHidden="0" w:uiPriority="19" w:unhideWhenUsed="0" w:qFormat="1"/>
-    <w:lsdException w:name="Intense Emphasis" w:semiHidden="0" w:uiPriority="21" w:unhideWhenUsed="0" w:qFormat="1"/>
-    <w:lsdException w:name="Subtle Reference" w:semiHidden="0" w:uiPriority="31" w:unhideWhenUsed="0" w:qFormat="1"/>
-    <w:lsdException w:name="Intense Reference" w:semiHidden="0" w:uiPriority="32" w:unhideWhenUsed="0" w:qFormat="1"/>
-    <w:lsdException w:name="Book Title" w:semiHidden="0" w:uiPriority="33" w:unhideWhenUsed="0" w:qFormat="1"/>
-    <w:lsdException w:name="Bibliography" w:uiPriority="37"/>
-    <w:lsdException w:name="TOC Heading" w:uiPriority="39" w:qFormat="1"/>
-  </w:latentStyles>
-  <w:style w:type="paragraph" w:default="1" w:styleId="Normal">
-    <w:name w:val="Normal"/>
-    <w:qFormat/>
-  </w:style>
-  <w:style w:type="character" w:default="1" w:styleId="DefaultParagraphFont">
-    <w:name w:val="Default Paragraph Font"/>
-    <w:uiPriority w:val="1"/>
-    <w:semiHidden/>
-    <w:unhideWhenUsed/>
-  </w:style>
-  <w:style w:type="table" w:default="1" w:styleId="TableNormal">
-    <w:name w:val="Normal Table"/>
-    <w:uiPriority w:val="99"/>
-    <w:semiHidden/>
-    <w:unhideWhenUsed/>
-    <w:tblPr>
-      <w:tblInd w:w="0" w:type="dxa"/>
-      <w:tblCellMar>
-        <w:top w:w="0" w:type="dxa"/>
-        <w:left w:w="108" w:type="dxa"/>
-        <w:bottom w:w="0" w:type="dxa"/>
-        <w:right w:w="108" w:type="dxa"/>
-      </w:tblCellMar>
-    </w:tblPr>
-  </w:style>
-  <w:style w:type="numbering" w:default="1" w:styleId="NoList">
-    <w:name w:val="No List"/>
-    <w:uiPriority w:val="99"/>
-    <w:semiHidden/>
-    <w:unhideWhenUsed/>
-  </w:style>
-  <w:style w:type="paragraph" w:customStyle="1" w:styleId="F2B73C00141344719106BE3752158BBA">
-    <w:name w:val="F2B73C00141344719106BE3752158BBA"/>
-    <w:rsid w:val="009E05D3"/>
-  </w:style>
-  <w:style w:type="paragraph" w:customStyle="1" w:styleId="3FDA9190EE2B406CB3D7EC8E271F31FC">
-    <w:name w:val="3FDA9190EE2B406CB3D7EC8E271F31FC"/>
-    <w:rsid w:val="009E05D3"/>
-  </w:style>
-  <w:style w:type="paragraph" w:customStyle="1" w:styleId="EF13FA9615DC4740BCC4E4E8594AE89C">
-    <w:name w:val="EF13FA9615DC4740BCC4E4E8594AE89C"/>
-    <w:rsid w:val="009E05D3"/>
-  </w:style>
-  <w:style w:type="paragraph" w:customStyle="1" w:styleId="EA3CFC8E6FBA4D64AA3B0BDC1BE34D70">
-    <w:name w:val="EA3CFC8E6FBA4D64AA3B0BDC1BE34D70"/>
-    <w:rsid w:val="009E05D3"/>
-  </w:style>
-  <w:style w:type="paragraph" w:customStyle="1" w:styleId="2B1B20FA1C7B4BF8BE8A3A30CEFF7012">
-    <w:name w:val="2B1B20FA1C7B4BF8BE8A3A30CEFF7012"/>
-    <w:rsid w:val="009E05D3"/>
-  </w:style>
-  <w:style w:type="paragraph" w:customStyle="1" w:styleId="DA364398378E4C64B6738EFA471366CE">
-    <w:name w:val="DA364398378E4C64B6738EFA471366CE"/>
-    <w:rsid w:val="009E05D3"/>
-  </w:style>
-</w:styles>
-</file>
-
-<file path=word/glossary/webSettings.xml><?xml version="1.0" encoding="utf-8"?>
-<w:webSettings xmlns:mc="http://schemas.openxmlformats.org/markup-compatibility/2006" xmlns:r="http://schemas.openxmlformats.org/officeDocument/2006/relationships" xmlns:w="http://schemas.openxmlformats.org/wordprocessingml/2006/main" xmlns:w14="http://schemas.microsoft.com/office/word/2010/wordml" mc:Ignorable="w14">
-  <w:optimizeForBrowser/>
-  <w:allowPNG/>
-</w:webSettings>
-</file>
-
 <file path=word/theme/theme1.xml><?xml version="1.0" encoding="utf-8"?>
 <a:theme xmlns:a="http://schemas.openxmlformats.org/drawingml/2006/main" name="Office Theme">
   <a:themeElements>
@@ -6135,7 +5529,7 @@
 </file>
 
 <file path=customXml/itemProps1.xml><?xml version="1.0" encoding="utf-8"?>
-<ds:datastoreItem xmlns:ds="http://schemas.openxmlformats.org/officeDocument/2006/customXml" ds:itemID="{7B0CB3B3-4BA2-4EC4-880D-ABC7F98172A3}">
+<ds:datastoreItem xmlns:ds="http://schemas.openxmlformats.org/officeDocument/2006/customXml" ds:itemID="{26189999-9A25-41E7-AC8E-871F751342E9}">
   <ds:schemaRefs>
     <ds:schemaRef ds:uri="http://schemas.openxmlformats.org/officeDocument/2006/bibliography"/>
   </ds:schemaRefs>

</xml_diff>